<commit_message>
Open punten huisstijl: vectorlogo, logovarianten en kleurproef
- Logo opnieuw opgebouwd als vector (SVG, PDF, PNG) in de kleuren van
  de site: volkleur, diapositief, blauw en wit, plus CMYK- en
  Pantone-PDF voor de drukker
- Kleurproef (A4) met CMYK-vlakken, Pantone-separaties en invulvakken
  voor de drukker
- Visitekaartje, briefpapier en PowerPoint-template gebruiken het
  nieuwe logo
- Brandguide: logovarianten, status in plaats van open punten

Co-Authored-By: Claude Opus 5.5 <noreply@anthropic.com>
Claude-Session: https://claude.ai/code/session_019FjnUhTF6nk5A2rERZua4r
</commit_message>
<xml_diff>
--- a/export/huisstijl/briefpapier-grip-op-stroom.docx
+++ b/export/huisstijl/briefpapier-grip-op-stroom.docx
@@ -550,7 +550,7 @@
   <w:p>
     <w:r>
       <w:drawing>
-        <wp:anchor distT="0" distB="0" distL="0" distR="0" simplePos="0" allowOverlap="1" behindDoc="0" locked="0" layoutInCell="1" relativeHeight="904875">
+        <wp:anchor distT="0" distB="0" distL="0" distR="0" simplePos="0" allowOverlap="1" behindDoc="0" locked="0" layoutInCell="1" relativeHeight="914400">
           <wp:simplePos x="0" y="0"/>
           <wp:positionH relativeFrom="page">
             <wp:posOffset>6047740</wp:posOffset>
@@ -558,7 +558,7 @@
           <wp:positionV relativeFrom="page">
             <wp:posOffset>504190</wp:posOffset>
           </wp:positionV>
-          <wp:extent cx="790575" cy="904875"/>
+          <wp:extent cx="790575" cy="914400"/>
           <wp:effectExtent t="0" r="0" b="0" l="0"/>
           <wp:wrapNone/>
           <wp:docPr id="1" name="logo" descr="Logo Grip op Stroom" title="Grip op Stroom"/>
@@ -584,7 +584,7 @@
                 <pic:spPr bwMode="auto">
                   <a:xfrm>
                     <a:off x="0" y="0"/>
-                    <a:ext cx="790575" cy="904875"/>
+                    <a:ext cx="790575" cy="914400"/>
                   </a:xfrm>
                   <a:prstGeom prst="rect">
                     <a:avLst/>

</xml_diff>